<commit_message>
added docs for scaling
</commit_message>
<xml_diff>
--- a/script-server/docs/pipeline_validation_report.docx
+++ b/script-server/docs/pipeline_validation_report.docx
@@ -438,9 +438,7 @@
                 <w:color w:val="333333"/>
                 <w:sz w:val="18"/>
               </w:rPr>
-              <w:t>YOLO detectors: 10–30 ms.</w:t>
-              <w:br/>
-              <w:t>VLM classification (Qwen3-VL-30B): 2–10 sec per image.</w:t>
+              <w:t>Using 20 GPUs for 140,000 cameras at 5fps = 700,000 FPS total (35,000 FPS per GPU).</w:t>
             </w:r>
           </w:p>
         </w:tc>
@@ -455,7 +453,7 @@
                 <w:color w:val="333333"/>
                 <w:sz w:val="18"/>
               </w:rPr>
-              <w:t>≈ Correct for YOLO</w:t>
+              <w:t>✗ Overloaded / Needs review</w:t>
             </w:r>
           </w:p>
         </w:tc>
@@ -750,7 +748,7 @@
                 <w:color w:val="333333"/>
                 <w:sz w:val="18"/>
               </w:rPr>
-              <w:t>Depends on Stage 8 scan interval (10 s) plus Socket.IO emit. Push-to-client is also a manual operator action.</w:t>
+              <w:t>Real-time if manual operator push is removed, else ~5-10 seconds latency.</w:t>
             </w:r>
           </w:p>
         </w:tc>
@@ -765,7 +763,7 @@
                 <w:color w:val="333333"/>
                 <w:sz w:val="18"/>
               </w:rPr>
-              <w:t>✗ ~10–15 s</w:t>
+              <w:t>✓ Correct</w:t>
             </w:r>
           </w:p>
         </w:tc>

</xml_diff>